<commit_message>
Fix fig6 fig9 None filter, update gitignore for Module4Lab1/data
</commit_message>
<xml_diff>
--- a/_site/Module4Lab1/lab06_frjulie8.docx
+++ b/_site/Module4Lab1/lab06_frjulie8.docx
@@ -1431,34 +1431,16 @@
         <w:rPr>
           <w:rStyle w:val="VerbatimChar"/>
         </w:rPr>
-        <w:t xml:space="preserve">26/06/10 20:20:19 WARN NativeCodeLoader: Unable to load native-hadoop library for your platform... using builtin-java classes where applicable</w:t>
-      </w:r>
-      <w:r>
-        <w:br/>
-      </w:r>
-      <w:r>
-        <w:rPr>
-          <w:rStyle w:val="VerbatimChar"/>
-        </w:rPr>
-        <w:t xml:space="preserve">26/06/10 20:20:26 WARN Utils: Service 'SparkUI' could not bind on port 4040. Attempting port 4041.</w:t>
-      </w:r>
-      <w:r>
-        <w:br/>
-      </w:r>
-      <w:r>
-        <w:rPr>
-          <w:rStyle w:val="VerbatimChar"/>
-        </w:rPr>
-        <w:t xml:space="preserve">26/06/10 20:20:26 WARN Utils: Service 'SparkUI' could not bind on port 4041. Attempting port 4042.</w:t>
-      </w:r>
-      <w:r>
-        <w:br/>
-      </w:r>
-      <w:r>
-        <w:rPr>
-          <w:rStyle w:val="VerbatimChar"/>
-        </w:rPr>
-        <w:t xml:space="preserve">[Stage 0:&gt;                                                          (0 + 0) / 1][Stage 0:&gt;                                                          (0 + 1) / 1]                                                                                [Stage 1:&gt;                                                          (0 + 1) / 1]                                                                                </w:t>
+        <w:t xml:space="preserve">26/06/10 22:15:38 WARN NativeCodeLoader: Unable to load native-hadoop library for your platform... using builtin-java classes where applicable</w:t>
+      </w:r>
+      <w:r>
+        <w:br/>
+      </w:r>
+      <w:r>
+        <w:rPr>
+          <w:rStyle w:val="VerbatimChar"/>
+        </w:rPr>
+        <w:t xml:space="preserve">[Stage 0:&gt;                                                          (0 + 1) / 1]                                                                                [Stage 1:&gt;                                                          (0 + 1) / 1]                                                                                </w:t>
       </w:r>
     </w:p>
     <w:p>
@@ -2659,7 +2641,7 @@
         <w:rPr>
           <w:rStyle w:val="VerbatimChar"/>
         </w:rPr>
-        <w:t xml:space="preserve">26/06/10 20:21:35 WARN SparkStringUtils: Truncated the string representation of a plan since it was too large. This behavior can be adjusted by setting 'spark.sql.debug.maxToStringFields'.</w:t>
+        <w:t xml:space="preserve">26/06/10 22:16:09 WARN SparkStringUtils: Truncated the string representation of a plan since it was too large. This behavior can be adjusted by setting 'spark.sql.debug.maxToStringFields'.</w:t>
       </w:r>
       <w:r>
         <w:br/>
@@ -4045,7 +4027,7 @@
         <w:rPr>
           <w:rStyle w:val="VerbatimChar"/>
         </w:rPr>
-        <w:t xml:space="preserve">[Stage 5:&gt;                                                          (0 + 1) / 1][Stage 7:&gt;                                                          (0 + 1) / 1]                                                                                </w:t>
+        <w:t xml:space="preserve">[Stage 5:&gt;                                                          (0 + 1) / 1]                                                                                </w:t>
       </w:r>
     </w:p>
     <w:p>
@@ -4553,7 +4535,172 @@
         <w:rPr>
           <w:rStyle w:val="NormalTok"/>
         </w:rPr>
-        <w:t xml:space="preserve"> df.groupBy(</w:t>
+        <w:t xml:space="preserve"> df.</w:t>
+      </w:r>
+      <w:r>
+        <w:rPr>
+          <w:rStyle w:val="BuiltInTok"/>
+        </w:rPr>
+        <w:t xml:space="preserve">filter</w:t>
+      </w:r>
+      <w:r>
+        <w:rPr>
+          <w:rStyle w:val="NormalTok"/>
+        </w:rPr>
+        <w:t xml:space="preserve">(</w:t>
+      </w:r>
+      <w:r>
+        <w:br/>
+      </w:r>
+      <w:r>
+        <w:rPr>
+          <w:rStyle w:val="NormalTok"/>
+        </w:rPr>
+        <w:t xml:space="preserve">    F.col(</w:t>
+      </w:r>
+      <w:r>
+        <w:rPr>
+          <w:rStyle w:val="StringTok"/>
+        </w:rPr>
+        <w:t xml:space="preserve">'REMOTE_TYPE_NAME'</w:t>
+      </w:r>
+      <w:r>
+        <w:rPr>
+          <w:rStyle w:val="NormalTok"/>
+        </w:rPr>
+        <w:t xml:space="preserve">).isNotNull() </w:t>
+      </w:r>
+      <w:r>
+        <w:rPr>
+          <w:rStyle w:val="OperatorTok"/>
+        </w:rPr>
+        <w:t xml:space="preserve">&amp;</w:t>
+      </w:r>
+      <w:r>
+        <w:br/>
+      </w:r>
+      <w:r>
+        <w:rPr>
+          <w:rStyle w:val="NormalTok"/>
+        </w:rPr>
+        <w:t xml:space="preserve">    (F.col(</w:t>
+      </w:r>
+      <w:r>
+        <w:rPr>
+          <w:rStyle w:val="StringTok"/>
+        </w:rPr>
+        <w:t xml:space="preserve">'REMOTE_TYPE_NAME'</w:t>
+      </w:r>
+      <w:r>
+        <w:rPr>
+          <w:rStyle w:val="NormalTok"/>
+        </w:rPr>
+        <w:t xml:space="preserve">) </w:t>
+      </w:r>
+      <w:r>
+        <w:rPr>
+          <w:rStyle w:val="OperatorTok"/>
+        </w:rPr>
+        <w:t xml:space="preserve">!=</w:t>
+      </w:r>
+      <w:r>
+        <w:rPr>
+          <w:rStyle w:val="NormalTok"/>
+        </w:rPr>
+        <w:t xml:space="preserve"> </w:t>
+      </w:r>
+      <w:r>
+        <w:rPr>
+          <w:rStyle w:val="StringTok"/>
+        </w:rPr>
+        <w:t xml:space="preserve">''</w:t>
+      </w:r>
+      <w:r>
+        <w:rPr>
+          <w:rStyle w:val="NormalTok"/>
+        </w:rPr>
+        <w:t xml:space="preserve">) </w:t>
+      </w:r>
+      <w:r>
+        <w:rPr>
+          <w:rStyle w:val="OperatorTok"/>
+        </w:rPr>
+        <w:t xml:space="preserve">&amp;</w:t>
+      </w:r>
+      <w:r>
+        <w:br/>
+      </w:r>
+      <w:r>
+        <w:rPr>
+          <w:rStyle w:val="NormalTok"/>
+        </w:rPr>
+        <w:t xml:space="preserve">    (F.col(</w:t>
+      </w:r>
+      <w:r>
+        <w:rPr>
+          <w:rStyle w:val="StringTok"/>
+        </w:rPr>
+        <w:t xml:space="preserve">'REMOTE_TYPE_NAME'</w:t>
+      </w:r>
+      <w:r>
+        <w:rPr>
+          <w:rStyle w:val="NormalTok"/>
+        </w:rPr>
+        <w:t xml:space="preserve">) </w:t>
+      </w:r>
+      <w:r>
+        <w:rPr>
+          <w:rStyle w:val="OperatorTok"/>
+        </w:rPr>
+        <w:t xml:space="preserve">!=</w:t>
+      </w:r>
+      <w:r>
+        <w:rPr>
+          <w:rStyle w:val="NormalTok"/>
+        </w:rPr>
+        <w:t xml:space="preserve"> </w:t>
+      </w:r>
+      <w:r>
+        <w:rPr>
+          <w:rStyle w:val="StringTok"/>
+        </w:rPr>
+        <w:t xml:space="preserve">'None'</w:t>
+      </w:r>
+      <w:r>
+        <w:rPr>
+          <w:rStyle w:val="NormalTok"/>
+        </w:rPr>
+        <w:t xml:space="preserve">)</w:t>
+      </w:r>
+      <w:r>
+        <w:br/>
+      </w:r>
+      <w:r>
+        <w:rPr>
+          <w:rStyle w:val="NormalTok"/>
+        </w:rPr>
+        <w:t xml:space="preserve">)</w:t>
+      </w:r>
+      <w:r>
+        <w:br/>
+      </w:r>
+      <w:r>
+        <w:rPr>
+          <w:rStyle w:val="NormalTok"/>
+        </w:rPr>
+        <w:t xml:space="preserve">df6 </w:t>
+      </w:r>
+      <w:r>
+        <w:rPr>
+          <w:rStyle w:val="OperatorTok"/>
+        </w:rPr>
+        <w:t xml:space="preserve">=</w:t>
+      </w:r>
+      <w:r>
+        <w:rPr>
+          <w:rStyle w:val="NormalTok"/>
+        </w:rPr>
+        <w:t xml:space="preserve"> df6.groupBy(</w:t>
       </w:r>
       <w:r>
         <w:rPr>
@@ -5779,7 +5926,7 @@
         <w:rPr>
           <w:rStyle w:val="VerbatimChar"/>
         </w:rPr>
-        <w:t xml:space="preserve">[Stage 19:&gt;                                                         (0 + 1) / 1]                                                                                [Stage 22:&gt;                                                         (0 + 1) / 1][Stage 22:==========================================================(1 + 0) / 1]                                                                                [Stage 25:&gt;                                                         (0 + 1) / 1]                                                                                </w:t>
+        <w:t xml:space="preserve">[Stage 19:&gt;                                                         (0 + 1) / 1]                                                                                [Stage 22:&gt;                                                         (0 + 1) / 1]                                                                                [Stage 25:&gt;                                                         (0 + 1) / 1]                                                                                </w:t>
       </w:r>
     </w:p>
     <w:p>
@@ -6530,7 +6677,16 @@
         <w:rPr>
           <w:rStyle w:val="NormalTok"/>
         </w:rPr>
-        <w:t xml:space="preserve">(F.col(</w:t>
+        <w:t xml:space="preserve">(</w:t>
+      </w:r>
+      <w:r>
+        <w:br/>
+      </w:r>
+      <w:r>
+        <w:rPr>
+          <w:rStyle w:val="NormalTok"/>
+        </w:rPr>
+        <w:t xml:space="preserve">    F.col(</w:t>
       </w:r>
       <w:r>
         <w:rPr>
@@ -6554,7 +6710,16 @@
         <w:rPr>
           <w:rStyle w:val="NormalTok"/>
         </w:rPr>
-        <w:t xml:space="preserve"> F.col(</w:t>
+        <w:t xml:space="preserve"> </w:t>
+      </w:r>
+      <w:r>
+        <w:br/>
+      </w:r>
+      <w:r>
+        <w:rPr>
+          <w:rStyle w:val="NormalTok"/>
+        </w:rPr>
+        <w:t xml:space="preserve">    F.col(</w:t>
       </w:r>
       <w:r>
         <w:rPr>
@@ -6566,7 +6731,118 @@
         <w:rPr>
           <w:rStyle w:val="NormalTok"/>
         </w:rPr>
-        <w:t xml:space="preserve">).isNotNull())</w:t>
+        <w:t xml:space="preserve">).isNotNull() </w:t>
+      </w:r>
+      <w:r>
+        <w:rPr>
+          <w:rStyle w:val="OperatorTok"/>
+        </w:rPr>
+        <w:t xml:space="preserve">&amp;</w:t>
+      </w:r>
+      <w:r>
+        <w:br/>
+      </w:r>
+      <w:r>
+        <w:rPr>
+          <w:rStyle w:val="NormalTok"/>
+        </w:rPr>
+        <w:t xml:space="preserve">    (F.col(</w:t>
+      </w:r>
+      <w:r>
+        <w:rPr>
+          <w:rStyle w:val="StringTok"/>
+        </w:rPr>
+        <w:t xml:space="preserve">'REMOTE_TYPE_NAME'</w:t>
+      </w:r>
+      <w:r>
+        <w:rPr>
+          <w:rStyle w:val="NormalTok"/>
+        </w:rPr>
+        <w:t xml:space="preserve">) </w:t>
+      </w:r>
+      <w:r>
+        <w:rPr>
+          <w:rStyle w:val="OperatorTok"/>
+        </w:rPr>
+        <w:t xml:space="preserve">!=</w:t>
+      </w:r>
+      <w:r>
+        <w:rPr>
+          <w:rStyle w:val="NormalTok"/>
+        </w:rPr>
+        <w:t xml:space="preserve"> </w:t>
+      </w:r>
+      <w:r>
+        <w:rPr>
+          <w:rStyle w:val="StringTok"/>
+        </w:rPr>
+        <w:t xml:space="preserve">''</w:t>
+      </w:r>
+      <w:r>
+        <w:rPr>
+          <w:rStyle w:val="NormalTok"/>
+        </w:rPr>
+        <w:t xml:space="preserve">) </w:t>
+      </w:r>
+      <w:r>
+        <w:rPr>
+          <w:rStyle w:val="OperatorTok"/>
+        </w:rPr>
+        <w:t xml:space="preserve">&amp;</w:t>
+      </w:r>
+      <w:r>
+        <w:br/>
+      </w:r>
+      <w:r>
+        <w:rPr>
+          <w:rStyle w:val="NormalTok"/>
+        </w:rPr>
+        <w:t xml:space="preserve">    (F.col(</w:t>
+      </w:r>
+      <w:r>
+        <w:rPr>
+          <w:rStyle w:val="StringTok"/>
+        </w:rPr>
+        <w:t xml:space="preserve">'REMOTE_TYPE_NAME'</w:t>
+      </w:r>
+      <w:r>
+        <w:rPr>
+          <w:rStyle w:val="NormalTok"/>
+        </w:rPr>
+        <w:t xml:space="preserve">) </w:t>
+      </w:r>
+      <w:r>
+        <w:rPr>
+          <w:rStyle w:val="OperatorTok"/>
+        </w:rPr>
+        <w:t xml:space="preserve">!=</w:t>
+      </w:r>
+      <w:r>
+        <w:rPr>
+          <w:rStyle w:val="NormalTok"/>
+        </w:rPr>
+        <w:t xml:space="preserve"> </w:t>
+      </w:r>
+      <w:r>
+        <w:rPr>
+          <w:rStyle w:val="StringTok"/>
+        </w:rPr>
+        <w:t xml:space="preserve">'None'</w:t>
+      </w:r>
+      <w:r>
+        <w:rPr>
+          <w:rStyle w:val="NormalTok"/>
+        </w:rPr>
+        <w:t xml:space="preserve">)</w:t>
+      </w:r>
+      <w:r>
+        <w:br/>
+      </w:r>
+      <w:r>
+        <w:rPr>
+          <w:rStyle w:val="NormalTok"/>
+        </w:rPr>
+        <w:t xml:space="preserve">)</w:t>
       </w:r>
       <w:r>
         <w:br/>

</xml_diff>

<commit_message>
Fix [None] filter in fig6 and fig9
</commit_message>
<xml_diff>
--- a/_site/Module4Lab1/lab06_frjulie8.docx
+++ b/_site/Module4Lab1/lab06_frjulie8.docx
@@ -1431,7 +1431,16 @@
         <w:rPr>
           <w:rStyle w:val="VerbatimChar"/>
         </w:rPr>
-        <w:t xml:space="preserve">26/06/10 22:15:38 WARN NativeCodeLoader: Unable to load native-hadoop library for your platform... using builtin-java classes where applicable</w:t>
+        <w:t xml:space="preserve">26/06/10 22:32:16 WARN NativeCodeLoader: Unable to load native-hadoop library for your platform... using builtin-java classes where applicable</w:t>
+      </w:r>
+      <w:r>
+        <w:br/>
+      </w:r>
+      <w:r>
+        <w:rPr>
+          <w:rStyle w:val="VerbatimChar"/>
+        </w:rPr>
+        <w:t xml:space="preserve">26/06/10 22:32:21 WARN Utils: Service 'SparkUI' could not bind on port 4040. Attempting port 4041.</w:t>
       </w:r>
       <w:r>
         <w:br/>
@@ -2641,7 +2650,7 @@
         <w:rPr>
           <w:rStyle w:val="VerbatimChar"/>
         </w:rPr>
-        <w:t xml:space="preserve">26/06/10 22:16:09 WARN SparkStringUtils: Truncated the string representation of a plan since it was too large. This behavior can be adjusted by setting 'spark.sql.debug.maxToStringFields'.</w:t>
+        <w:t xml:space="preserve">26/06/10 22:33:10 WARN SparkStringUtils: Truncated the string representation of a plan since it was too large. This behavior can be adjusted by setting 'spark.sql.debug.maxToStringFields'.</w:t>
       </w:r>
       <w:r>
         <w:br/>
@@ -4027,7 +4036,7 @@
         <w:rPr>
           <w:rStyle w:val="VerbatimChar"/>
         </w:rPr>
-        <w:t xml:space="preserve">[Stage 5:&gt;                                                          (0 + 1) / 1]                                                                                </w:t>
+        <w:t xml:space="preserve">[Stage 5:&gt;                                                          (0 + 1) / 1][Stage 7:&gt;                                                          (0 + 1) / 1]                                                                                [Stage 9:&gt;                                                          (0 + 1) / 1]                                                                                </w:t>
       </w:r>
     </w:p>
     <w:p>
@@ -4613,58 +4622,7 @@
         <w:rPr>
           <w:rStyle w:val="StringTok"/>
         </w:rPr>
-        <w:t xml:space="preserve">''</w:t>
-      </w:r>
-      <w:r>
-        <w:rPr>
-          <w:rStyle w:val="NormalTok"/>
-        </w:rPr>
-        <w:t xml:space="preserve">) </w:t>
-      </w:r>
-      <w:r>
-        <w:rPr>
-          <w:rStyle w:val="OperatorTok"/>
-        </w:rPr>
-        <w:t xml:space="preserve">&amp;</w:t>
-      </w:r>
-      <w:r>
-        <w:br/>
-      </w:r>
-      <w:r>
-        <w:rPr>
-          <w:rStyle w:val="NormalTok"/>
-        </w:rPr>
-        <w:t xml:space="preserve">    (F.col(</w:t>
-      </w:r>
-      <w:r>
-        <w:rPr>
-          <w:rStyle w:val="StringTok"/>
-        </w:rPr>
-        <w:t xml:space="preserve">'REMOTE_TYPE_NAME'</w:t>
-      </w:r>
-      <w:r>
-        <w:rPr>
-          <w:rStyle w:val="NormalTok"/>
-        </w:rPr>
-        <w:t xml:space="preserve">) </w:t>
-      </w:r>
-      <w:r>
-        <w:rPr>
-          <w:rStyle w:val="OperatorTok"/>
-        </w:rPr>
-        <w:t xml:space="preserve">!=</w:t>
-      </w:r>
-      <w:r>
-        <w:rPr>
-          <w:rStyle w:val="NormalTok"/>
-        </w:rPr>
-        <w:t xml:space="preserve"> </w:t>
-      </w:r>
-      <w:r>
-        <w:rPr>
-          <w:rStyle w:val="StringTok"/>
-        </w:rPr>
-        <w:t xml:space="preserve">'None'</w:t>
+        <w:t xml:space="preserve">'[None]'</w:t>
       </w:r>
       <w:r>
         <w:rPr>
@@ -6707,127 +6665,70 @@
         <w:t xml:space="preserve">&amp;</w:t>
       </w:r>
       <w:r>
+        <w:br/>
+      </w:r>
+      <w:r>
+        <w:rPr>
+          <w:rStyle w:val="NormalTok"/>
+        </w:rPr>
+        <w:t xml:space="preserve">    F.col(</w:t>
+      </w:r>
+      <w:r>
+        <w:rPr>
+          <w:rStyle w:val="StringTok"/>
+        </w:rPr>
+        <w:t xml:space="preserve">'REMOTE_TYPE_NAME'</w:t>
+      </w:r>
+      <w:r>
+        <w:rPr>
+          <w:rStyle w:val="NormalTok"/>
+        </w:rPr>
+        <w:t xml:space="preserve">).isNotNull() </w:t>
+      </w:r>
+      <w:r>
+        <w:rPr>
+          <w:rStyle w:val="OperatorTok"/>
+        </w:rPr>
+        <w:t xml:space="preserve">&amp;</w:t>
+      </w:r>
+      <w:r>
+        <w:br/>
+      </w:r>
+      <w:r>
+        <w:rPr>
+          <w:rStyle w:val="NormalTok"/>
+        </w:rPr>
+        <w:t xml:space="preserve">    (F.col(</w:t>
+      </w:r>
+      <w:r>
+        <w:rPr>
+          <w:rStyle w:val="StringTok"/>
+        </w:rPr>
+        <w:t xml:space="preserve">'REMOTE_TYPE_NAME'</w:t>
+      </w:r>
+      <w:r>
+        <w:rPr>
+          <w:rStyle w:val="NormalTok"/>
+        </w:rPr>
+        <w:t xml:space="preserve">) </w:t>
+      </w:r>
+      <w:r>
+        <w:rPr>
+          <w:rStyle w:val="OperatorTok"/>
+        </w:rPr>
+        <w:t xml:space="preserve">!=</w:t>
+      </w:r>
+      <w:r>
         <w:rPr>
           <w:rStyle w:val="NormalTok"/>
         </w:rPr>
         <w:t xml:space="preserve"> </w:t>
       </w:r>
       <w:r>
-        <w:br/>
-      </w:r>
-      <w:r>
-        <w:rPr>
-          <w:rStyle w:val="NormalTok"/>
-        </w:rPr>
-        <w:t xml:space="preserve">    F.col(</w:t>
-      </w:r>
-      <w:r>
-        <w:rPr>
-          <w:rStyle w:val="StringTok"/>
-        </w:rPr>
-        <w:t xml:space="preserve">'REMOTE_TYPE_NAME'</w:t>
-      </w:r>
-      <w:r>
-        <w:rPr>
-          <w:rStyle w:val="NormalTok"/>
-        </w:rPr>
-        <w:t xml:space="preserve">).isNotNull() </w:t>
-      </w:r>
-      <w:r>
-        <w:rPr>
-          <w:rStyle w:val="OperatorTok"/>
-        </w:rPr>
-        <w:t xml:space="preserve">&amp;</w:t>
-      </w:r>
-      <w:r>
-        <w:br/>
-      </w:r>
-      <w:r>
-        <w:rPr>
-          <w:rStyle w:val="NormalTok"/>
-        </w:rPr>
-        <w:t xml:space="preserve">    (F.col(</w:t>
-      </w:r>
-      <w:r>
-        <w:rPr>
-          <w:rStyle w:val="StringTok"/>
-        </w:rPr>
-        <w:t xml:space="preserve">'REMOTE_TYPE_NAME'</w:t>
-      </w:r>
-      <w:r>
-        <w:rPr>
-          <w:rStyle w:val="NormalTok"/>
-        </w:rPr>
-        <w:t xml:space="preserve">) </w:t>
-      </w:r>
-      <w:r>
-        <w:rPr>
-          <w:rStyle w:val="OperatorTok"/>
-        </w:rPr>
-        <w:t xml:space="preserve">!=</w:t>
-      </w:r>
-      <w:r>
-        <w:rPr>
-          <w:rStyle w:val="NormalTok"/>
-        </w:rPr>
-        <w:t xml:space="preserve"> </w:t>
-      </w:r>
-      <w:r>
-        <w:rPr>
-          <w:rStyle w:val="StringTok"/>
-        </w:rPr>
-        <w:t xml:space="preserve">''</w:t>
-      </w:r>
-      <w:r>
-        <w:rPr>
-          <w:rStyle w:val="NormalTok"/>
-        </w:rPr>
-        <w:t xml:space="preserve">) </w:t>
-      </w:r>
-      <w:r>
-        <w:rPr>
-          <w:rStyle w:val="OperatorTok"/>
-        </w:rPr>
-        <w:t xml:space="preserve">&amp;</w:t>
-      </w:r>
-      <w:r>
-        <w:br/>
-      </w:r>
-      <w:r>
-        <w:rPr>
-          <w:rStyle w:val="NormalTok"/>
-        </w:rPr>
-        <w:t xml:space="preserve">    (F.col(</w:t>
-      </w:r>
-      <w:r>
-        <w:rPr>
-          <w:rStyle w:val="StringTok"/>
-        </w:rPr>
-        <w:t xml:space="preserve">'REMOTE_TYPE_NAME'</w:t>
-      </w:r>
-      <w:r>
-        <w:rPr>
-          <w:rStyle w:val="NormalTok"/>
-        </w:rPr>
-        <w:t xml:space="preserve">) </w:t>
-      </w:r>
-      <w:r>
-        <w:rPr>
-          <w:rStyle w:val="OperatorTok"/>
-        </w:rPr>
-        <w:t xml:space="preserve">!=</w:t>
-      </w:r>
-      <w:r>
-        <w:rPr>
-          <w:rStyle w:val="NormalTok"/>
-        </w:rPr>
-        <w:t xml:space="preserve"> </w:t>
-      </w:r>
-      <w:r>
-        <w:rPr>
-          <w:rStyle w:val="StringTok"/>
-        </w:rPr>
-        <w:t xml:space="preserve">'None'</w:t>
+        <w:rPr>
+          <w:rStyle w:val="StringTok"/>
+        </w:rPr>
+        <w:t xml:space="preserve">'[None]'</w:t>
       </w:r>
       <w:r>
         <w:rPr>

</xml_diff>

<commit_message>
Rename [None] to Not Specified in fig6 and fig9
</commit_message>
<xml_diff>
--- a/_site/Module4Lab1/lab06_frjulie8.docx
+++ b/_site/Module4Lab1/lab06_frjulie8.docx
@@ -1431,25 +1431,25 @@
         <w:rPr>
           <w:rStyle w:val="VerbatimChar"/>
         </w:rPr>
-        <w:t xml:space="preserve">26/06/10 22:32:16 WARN NativeCodeLoader: Unable to load native-hadoop library for your platform... using builtin-java classes where applicable</w:t>
-      </w:r>
-      <w:r>
-        <w:br/>
-      </w:r>
-      <w:r>
-        <w:rPr>
-          <w:rStyle w:val="VerbatimChar"/>
-        </w:rPr>
-        <w:t xml:space="preserve">26/06/10 22:32:21 WARN Utils: Service 'SparkUI' could not bind on port 4040. Attempting port 4041.</w:t>
-      </w:r>
-      <w:r>
-        <w:br/>
-      </w:r>
-      <w:r>
-        <w:rPr>
-          <w:rStyle w:val="VerbatimChar"/>
-        </w:rPr>
-        <w:t xml:space="preserve">[Stage 0:&gt;                                                          (0 + 1) / 1]                                                                                [Stage 1:&gt;                                                          (0 + 1) / 1]                                                                                </w:t>
+        <w:t xml:space="preserve">26/06/10 22:45:13 WARN NativeCodeLoader: Unable to load native-hadoop library for your platform... using builtin-java classes where applicable</w:t>
+      </w:r>
+      <w:r>
+        <w:br/>
+      </w:r>
+      <w:r>
+        <w:rPr>
+          <w:rStyle w:val="VerbatimChar"/>
+        </w:rPr>
+        <w:t xml:space="preserve">26/06/10 22:45:18 WARN Utils: Service 'SparkUI' could not bind on port 4040. Attempting port 4041.</w:t>
+      </w:r>
+      <w:r>
+        <w:br/>
+      </w:r>
+      <w:r>
+        <w:rPr>
+          <w:rStyle w:val="VerbatimChar"/>
+        </w:rPr>
+        <w:t xml:space="preserve">[Stage 0:&gt;                                                          (0 + 0) / 1][Stage 0:&gt;                                                          (0 + 1) / 1]                                                                                [Stage 1:&gt;                                                          (0 + 1) / 1][Stage 1:&gt;                                                          (0 + 1) / 1][Stage 1:&gt;                                                          (0 + 1) / 1]                                                                                </w:t>
       </w:r>
     </w:p>
     <w:p>
@@ -2650,7 +2650,7 @@
         <w:rPr>
           <w:rStyle w:val="VerbatimChar"/>
         </w:rPr>
-        <w:t xml:space="preserve">26/06/10 22:33:10 WARN SparkStringUtils: Truncated the string representation of a plan since it was too large. This behavior can be adjusted by setting 'spark.sql.debug.maxToStringFields'.</w:t>
+        <w:t xml:space="preserve">26/06/10 22:48:57 WARN SparkStringUtils: Truncated the string representation of a plan since it was too large. This behavior can be adjusted by setting 'spark.sql.debug.maxToStringFields'.</w:t>
       </w:r>
       <w:r>
         <w:br/>
@@ -4036,7 +4036,7 @@
         <w:rPr>
           <w:rStyle w:val="VerbatimChar"/>
         </w:rPr>
-        <w:t xml:space="preserve">[Stage 5:&gt;                                                          (0 + 1) / 1][Stage 7:&gt;                                                          (0 + 1) / 1]                                                                                [Stage 9:&gt;                                                          (0 + 1) / 1]                                                                                </w:t>
+        <w:t xml:space="preserve">[Stage 5:&gt;                                                          (0 + 1) / 1]                                                                                [Stage 9:&gt;                                                          (0 + 1) / 1]                                                                                </w:t>
       </w:r>
     </w:p>
     <w:p>
@@ -4556,16 +4556,7 @@
         <w:rPr>
           <w:rStyle w:val="NormalTok"/>
         </w:rPr>
-        <w:t xml:space="preserve">(</w:t>
-      </w:r>
-      <w:r>
-        <w:br/>
-      </w:r>
-      <w:r>
-        <w:rPr>
-          <w:rStyle w:val="NormalTok"/>
-        </w:rPr>
-        <w:t xml:space="preserve">    F.col(</w:t>
+        <w:t xml:space="preserve">(F.col(</w:t>
       </w:r>
       <w:r>
         <w:rPr>
@@ -4577,22 +4568,28 @@
         <w:rPr>
           <w:rStyle w:val="NormalTok"/>
         </w:rPr>
-        <w:t xml:space="preserve">).isNotNull() </w:t>
-      </w:r>
-      <w:r>
-        <w:rPr>
-          <w:rStyle w:val="OperatorTok"/>
-        </w:rPr>
-        <w:t xml:space="preserve">&amp;</w:t>
-      </w:r>
-      <w:r>
-        <w:br/>
-      </w:r>
-      <w:r>
-        <w:rPr>
-          <w:rStyle w:val="NormalTok"/>
-        </w:rPr>
-        <w:t xml:space="preserve">    (F.col(</w:t>
+        <w:t xml:space="preserve">).isNotNull())</w:t>
+      </w:r>
+      <w:r>
+        <w:br/>
+      </w:r>
+      <w:r>
+        <w:rPr>
+          <w:rStyle w:val="NormalTok"/>
+        </w:rPr>
+        <w:t xml:space="preserve">df6 </w:t>
+      </w:r>
+      <w:r>
+        <w:rPr>
+          <w:rStyle w:val="OperatorTok"/>
+        </w:rPr>
+        <w:t xml:space="preserve">=</w:t>
+      </w:r>
+      <w:r>
+        <w:rPr>
+          <w:rStyle w:val="NormalTok"/>
+        </w:rPr>
+        <w:t xml:space="preserve"> df6.withColumn(</w:t>
       </w:r>
       <w:r>
         <w:rPr>
@@ -4604,13 +4601,34 @@
         <w:rPr>
           <w:rStyle w:val="NormalTok"/>
         </w:rPr>
+        <w:t xml:space="preserve">,</w:t>
+      </w:r>
+      <w:r>
+        <w:br/>
+      </w:r>
+      <w:r>
+        <w:rPr>
+          <w:rStyle w:val="NormalTok"/>
+        </w:rPr>
+        <w:t xml:space="preserve">    F.when(F.col(</w:t>
+      </w:r>
+      <w:r>
+        <w:rPr>
+          <w:rStyle w:val="StringTok"/>
+        </w:rPr>
+        <w:t xml:space="preserve">'REMOTE_TYPE_NAME'</w:t>
+      </w:r>
+      <w:r>
+        <w:rPr>
+          <w:rStyle w:val="NormalTok"/>
+        </w:rPr>
         <w:t xml:space="preserve">) </w:t>
       </w:r>
       <w:r>
         <w:rPr>
           <w:rStyle w:val="OperatorTok"/>
         </w:rPr>
-        <w:t xml:space="preserve">!=</w:t>
+        <w:t xml:space="preserve">==</w:t>
       </w:r>
       <w:r>
         <w:rPr>
@@ -4628,7 +4646,40 @@
         <w:rPr>
           <w:rStyle w:val="NormalTok"/>
         </w:rPr>
+        <w:t xml:space="preserve">, </w:t>
+      </w:r>
+      <w:r>
+        <w:rPr>
+          <w:rStyle w:val="StringTok"/>
+        </w:rPr>
+        <w:t xml:space="preserve">'Not Specified'</w:t>
+      </w:r>
+      <w:r>
+        <w:rPr>
+          <w:rStyle w:val="NormalTok"/>
+        </w:rPr>
         <w:t xml:space="preserve">)</w:t>
+      </w:r>
+      <w:r>
+        <w:br/>
+      </w:r>
+      <w:r>
+        <w:rPr>
+          <w:rStyle w:val="NormalTok"/>
+        </w:rPr>
+        <w:t xml:space="preserve">     .otherwise(F.col(</w:t>
+      </w:r>
+      <w:r>
+        <w:rPr>
+          <w:rStyle w:val="StringTok"/>
+        </w:rPr>
+        <w:t xml:space="preserve">'REMOTE_TYPE_NAME'</w:t>
+      </w:r>
+      <w:r>
+        <w:rPr>
+          <w:rStyle w:val="NormalTok"/>
+        </w:rPr>
+        <w:t xml:space="preserve">))</w:t>
       </w:r>
       <w:r>
         <w:br/>
@@ -5027,7 +5078,7 @@
         <w:pStyle w:val="FirstParagraph"/>
       </w:pPr>
       <w:r>
-        <w:t xml:space="preserve">On-site roles still represent the majority of postings, indicating that most employers continue to prefer in-person work arrangements despite the remote work shift during the pandemic era. Hybrid and fully remote positions together form a significant minority, reflecting growing employer flexibility particularly in knowledge-work sectors.</w:t>
+        <w:t xml:space="preserve">The majority of job postings do not specify a work arrangement, suggesting many employers leave remote policy ambiguous in their listings. Among postings that do specify, remote roles account for a notably larger share than hybrid or on-site, indicating that employers who signal flexibility tend to offer fully remote options.</w:t>
       </w:r>
     </w:p>
     <w:bookmarkEnd w:id="25"/>
@@ -5884,7 +5935,7 @@
         <w:rPr>
           <w:rStyle w:val="VerbatimChar"/>
         </w:rPr>
-        <w:t xml:space="preserve">[Stage 19:&gt;                                                         (0 + 1) / 1]                                                                                [Stage 22:&gt;                                                         (0 + 1) / 1]                                                                                [Stage 25:&gt;                                                         (0 + 1) / 1]                                                                                </w:t>
+        <w:t xml:space="preserve">[Stage 19:&gt;                                                         (0 + 1) / 1]                                                                                [Stage 22:&gt;                                                         (0 + 1) / 1]                                                                                [Stage 25:&gt;                                                         (0 + 1) / 1][Stage 25:==========================================================(1 + 0) / 1]                                                                                </w:t>
       </w:r>
     </w:p>
     <w:p>
@@ -6635,16 +6686,7 @@
         <w:rPr>
           <w:rStyle w:val="NormalTok"/>
         </w:rPr>
-        <w:t xml:space="preserve">(</w:t>
-      </w:r>
-      <w:r>
-        <w:br/>
-      </w:r>
-      <w:r>
-        <w:rPr>
-          <w:rStyle w:val="NormalTok"/>
-        </w:rPr>
-        <w:t xml:space="preserve">    F.col(</w:t>
+        <w:t xml:space="preserve">(F.col(</w:t>
       </w:r>
       <w:r>
         <w:rPr>
@@ -6665,13 +6707,10 @@
         <w:t xml:space="preserve">&amp;</w:t>
       </w:r>
       <w:r>
-        <w:br/>
-      </w:r>
-      <w:r>
-        <w:rPr>
-          <w:rStyle w:val="NormalTok"/>
-        </w:rPr>
-        <w:t xml:space="preserve">    F.col(</w:t>
+        <w:rPr>
+          <w:rStyle w:val="NormalTok"/>
+        </w:rPr>
+        <w:t xml:space="preserve"> F.col(</w:t>
       </w:r>
       <w:r>
         <w:rPr>
@@ -6683,22 +6722,28 @@
         <w:rPr>
           <w:rStyle w:val="NormalTok"/>
         </w:rPr>
-        <w:t xml:space="preserve">).isNotNull() </w:t>
-      </w:r>
-      <w:r>
-        <w:rPr>
-          <w:rStyle w:val="OperatorTok"/>
-        </w:rPr>
-        <w:t xml:space="preserve">&amp;</w:t>
-      </w:r>
-      <w:r>
-        <w:br/>
-      </w:r>
-      <w:r>
-        <w:rPr>
-          <w:rStyle w:val="NormalTok"/>
-        </w:rPr>
-        <w:t xml:space="preserve">    (F.col(</w:t>
+        <w:t xml:space="preserve">).isNotNull())</w:t>
+      </w:r>
+      <w:r>
+        <w:br/>
+      </w:r>
+      <w:r>
+        <w:rPr>
+          <w:rStyle w:val="NormalTok"/>
+        </w:rPr>
+        <w:t xml:space="preserve">df9 </w:t>
+      </w:r>
+      <w:r>
+        <w:rPr>
+          <w:rStyle w:val="OperatorTok"/>
+        </w:rPr>
+        <w:t xml:space="preserve">=</w:t>
+      </w:r>
+      <w:r>
+        <w:rPr>
+          <w:rStyle w:val="NormalTok"/>
+        </w:rPr>
+        <w:t xml:space="preserve"> df9.withColumn(</w:t>
       </w:r>
       <w:r>
         <w:rPr>
@@ -6710,13 +6755,34 @@
         <w:rPr>
           <w:rStyle w:val="NormalTok"/>
         </w:rPr>
+        <w:t xml:space="preserve">,</w:t>
+      </w:r>
+      <w:r>
+        <w:br/>
+      </w:r>
+      <w:r>
+        <w:rPr>
+          <w:rStyle w:val="NormalTok"/>
+        </w:rPr>
+        <w:t xml:space="preserve">    F.when(F.col(</w:t>
+      </w:r>
+      <w:r>
+        <w:rPr>
+          <w:rStyle w:val="StringTok"/>
+        </w:rPr>
+        <w:t xml:space="preserve">'REMOTE_TYPE_NAME'</w:t>
+      </w:r>
+      <w:r>
+        <w:rPr>
+          <w:rStyle w:val="NormalTok"/>
+        </w:rPr>
         <w:t xml:space="preserve">) </w:t>
       </w:r>
       <w:r>
         <w:rPr>
           <w:rStyle w:val="OperatorTok"/>
         </w:rPr>
-        <w:t xml:space="preserve">!=</w:t>
+        <w:t xml:space="preserve">==</w:t>
       </w:r>
       <w:r>
         <w:rPr>
@@ -6734,7 +6800,40 @@
         <w:rPr>
           <w:rStyle w:val="NormalTok"/>
         </w:rPr>
+        <w:t xml:space="preserve">, </w:t>
+      </w:r>
+      <w:r>
+        <w:rPr>
+          <w:rStyle w:val="StringTok"/>
+        </w:rPr>
+        <w:t xml:space="preserve">'Not Specified'</w:t>
+      </w:r>
+      <w:r>
+        <w:rPr>
+          <w:rStyle w:val="NormalTok"/>
+        </w:rPr>
         <w:t xml:space="preserve">)</w:t>
+      </w:r>
+      <w:r>
+        <w:br/>
+      </w:r>
+      <w:r>
+        <w:rPr>
+          <w:rStyle w:val="NormalTok"/>
+        </w:rPr>
+        <w:t xml:space="preserve">     .otherwise(F.col(</w:t>
+      </w:r>
+      <w:r>
+        <w:rPr>
+          <w:rStyle w:val="StringTok"/>
+        </w:rPr>
+        <w:t xml:space="preserve">'REMOTE_TYPE_NAME'</w:t>
+      </w:r>
+      <w:r>
+        <w:rPr>
+          <w:rStyle w:val="NormalTok"/>
+        </w:rPr>
+        <w:t xml:space="preserve">))</w:t>
       </w:r>
       <w:r>
         <w:br/>

</xml_diff>